<commit_message>
78: styles part, review fixes, ticket done
Co-Authored-By: Claude Opus 5.5 (1M context) <noreply@anthropic.com>
</commit_message>
<xml_diff>
--- a/fixtures/midway/manuscript-v1.docx
+++ b/fixtures/midway/manuscript-v1.docx
@@ -272,4 +272,30 @@
   <w15:commentEx w15:paraId="0000000C" w15:done="0"/>
   <w15:commentEx w15:paraId="0000000D" w15:done="0"/>
 </w15:commentsEx>
+</file>
+
+<file path=word/styles.xml><?xml version="1.0" encoding="utf-8"?>
+<w:styles xmlns:w="http://schemas.openxmlformats.org/wordprocessingml/2006/main" xmlns:w14="http://schemas.microsoft.com/office/word/2010/wordml" xmlns:w15="http://schemas.microsoft.com/office/word/2012/wordml" xmlns:m="http://schemas.openxmlformats.org/officeDocument/2006/math">
+  <w:style w:type="paragraph" w:styleId="Normal">
+    <w:name w:val="Normal"/>
+  </w:style>
+  <w:style w:type="paragraph" w:styleId="Title">
+    <w:name w:val="Title"/>
+  </w:style>
+  <w:style w:type="paragraph" w:styleId="Abstract">
+    <w:name w:val="Abstract"/>
+  </w:style>
+  <w:style w:type="paragraph" w:styleId="Heading1">
+    <w:name w:val="heading 1"/>
+    <w:pPr>
+      <w:outlineLvl w:val="0"/>
+    </w:pPr>
+  </w:style>
+  <w:style w:type="paragraph" w:styleId="Caption">
+    <w:name w:val="caption"/>
+  </w:style>
+  <w:style w:type="paragraph" w:styleId="Bibliography">
+    <w:name w:val="Bibliography"/>
+  </w:style>
+</w:styles>
 </file>
</xml_diff>